<commit_message>
fecha limite en solicitud formal
</commit_message>
<xml_diff>
--- a/public/templates/Solicitud_formal_template.docx
+++ b/public/templates/Solicitud_formal_template.docx
@@ -177,25 +177,7 @@
                 <w:sz w:val="20"/>
                 <w:szCs w:val="20"/>
               </w:rPr>
-              <w:t>{</w:t>
-            </w:r>
-            <w:proofErr w:type="spellStart"/>
-            <w:r>
-              <w:rPr>
-                <w:rFonts w:ascii="Arial Nova" w:hAnsi="Arial Nova"/>
-                <w:sz w:val="20"/>
-                <w:szCs w:val="20"/>
-              </w:rPr>
-              <w:t>idReferencia</w:t>
-            </w:r>
-            <w:proofErr w:type="spellEnd"/>
-            <w:r>
-              <w:rPr>
-                <w:rFonts w:ascii="Arial Nova" w:hAnsi="Arial Nova"/>
-                <w:sz w:val="20"/>
-                <w:szCs w:val="20"/>
-              </w:rPr>
-              <w:t>}</w:t>
+              <w:t>{idReferencia}</w:t>
             </w:r>
           </w:p>
         </w:tc>
@@ -368,25 +350,7 @@
                 <w:sz w:val="20"/>
                 <w:szCs w:val="20"/>
               </w:rPr>
-              <w:t>{</w:t>
-            </w:r>
-            <w:proofErr w:type="spellStart"/>
-            <w:r>
-              <w:rPr>
-                <w:rFonts w:ascii="Arial Nova" w:hAnsi="Arial Nova"/>
-                <w:sz w:val="20"/>
-                <w:szCs w:val="20"/>
-              </w:rPr>
-              <w:t>problematica</w:t>
-            </w:r>
-            <w:proofErr w:type="spellEnd"/>
-            <w:r>
-              <w:rPr>
-                <w:rFonts w:ascii="Arial Nova" w:hAnsi="Arial Nova"/>
-                <w:sz w:val="20"/>
-                <w:szCs w:val="20"/>
-              </w:rPr>
-              <w:t>}</w:t>
+              <w:t>{problematica}</w:t>
             </w:r>
           </w:p>
         </w:tc>
@@ -449,25 +413,7 @@
                 <w:sz w:val="20"/>
                 <w:szCs w:val="20"/>
               </w:rPr>
-              <w:t>{</w:t>
-            </w:r>
-            <w:proofErr w:type="spellStart"/>
-            <w:r>
-              <w:rPr>
-                <w:rFonts w:ascii="Arial Nova" w:hAnsi="Arial Nova"/>
-                <w:sz w:val="20"/>
-                <w:szCs w:val="20"/>
-              </w:rPr>
-              <w:t>piezasProducto</w:t>
-            </w:r>
-            <w:proofErr w:type="spellEnd"/>
-            <w:r>
-              <w:rPr>
-                <w:rFonts w:ascii="Arial Nova" w:hAnsi="Arial Nova"/>
-                <w:sz w:val="20"/>
-                <w:szCs w:val="20"/>
-              </w:rPr>
-              <w:t>}</w:t>
+              <w:t>{piezasProducto}</w:t>
             </w:r>
           </w:p>
         </w:tc>
@@ -741,25 +687,7 @@
                 <w:sz w:val="20"/>
                 <w:szCs w:val="20"/>
               </w:rPr>
-              <w:t>{</w:t>
-            </w:r>
-            <w:proofErr w:type="spellStart"/>
-            <w:r>
-              <w:rPr>
-                <w:rFonts w:ascii="Arial Nova" w:hAnsi="Arial Nova"/>
-                <w:sz w:val="20"/>
-                <w:szCs w:val="20"/>
-              </w:rPr>
-              <w:t>cuartoLimpio</w:t>
-            </w:r>
-            <w:proofErr w:type="spellEnd"/>
-            <w:r>
-              <w:rPr>
-                <w:rFonts w:ascii="Arial Nova" w:hAnsi="Arial Nova"/>
-                <w:sz w:val="20"/>
-                <w:szCs w:val="20"/>
-              </w:rPr>
-              <w:t>}</w:t>
+              <w:t>{cuartoLimpio}</w:t>
             </w:r>
           </w:p>
         </w:tc>
@@ -865,25 +793,7 @@
                 <w:sz w:val="20"/>
                 <w:szCs w:val="20"/>
               </w:rPr>
-              <w:t>{</w:t>
-            </w:r>
-            <w:proofErr w:type="spellStart"/>
-            <w:r>
-              <w:rPr>
-                <w:rFonts w:ascii="Arial Nova" w:hAnsi="Arial Nova"/>
-                <w:sz w:val="20"/>
-                <w:szCs w:val="20"/>
-              </w:rPr>
-              <w:t>rigidezDureza</w:t>
-            </w:r>
-            <w:proofErr w:type="spellEnd"/>
-            <w:r>
-              <w:rPr>
-                <w:rFonts w:ascii="Arial Nova" w:hAnsi="Arial Nova"/>
-                <w:sz w:val="20"/>
-                <w:szCs w:val="20"/>
-              </w:rPr>
-              <w:t>}</w:t>
+              <w:t>{rigidezDureza}</w:t>
             </w:r>
           </w:p>
         </w:tc>
@@ -1042,25 +952,7 @@
                 <w:sz w:val="20"/>
                 <w:szCs w:val="20"/>
               </w:rPr>
-              <w:t>{</w:t>
-            </w:r>
-            <w:proofErr w:type="spellStart"/>
-            <w:r>
-              <w:rPr>
-                <w:rFonts w:ascii="Arial Nova" w:hAnsi="Arial Nova"/>
-                <w:sz w:val="20"/>
-                <w:szCs w:val="20"/>
-              </w:rPr>
-              <w:t>dimensionesCriticas</w:t>
-            </w:r>
-            <w:proofErr w:type="spellEnd"/>
-            <w:r>
-              <w:rPr>
-                <w:rFonts w:ascii="Arial Nova" w:hAnsi="Arial Nova"/>
-                <w:sz w:val="20"/>
-                <w:szCs w:val="20"/>
-              </w:rPr>
-              <w:t>}</w:t>
+              <w:t>{dimensionesCriticas}</w:t>
             </w:r>
           </w:p>
         </w:tc>
@@ -1090,7 +982,18 @@
                 <w:szCs w:val="20"/>
                 <w:lang w:val="es-ES"/>
               </w:rPr>
-              <w:t xml:space="preserve">Tiempo para trabajar </w:t>
+              <w:t>Deadline</w:t>
+            </w:r>
+            <w:r>
+              <w:rPr>
+                <w:rFonts w:ascii="Arial Nova" w:hAnsi="Arial Nova"/>
+                <w:b/>
+                <w:bCs/>
+                <w:sz w:val="20"/>
+                <w:szCs w:val="20"/>
+                <w:lang w:val="es-ES"/>
+              </w:rPr>
+              <w:t xml:space="preserve"> </w:t>
             </w:r>
           </w:p>
         </w:tc>
@@ -1112,26 +1015,9 @@
                 <w:rFonts w:ascii="Arial Nova" w:hAnsi="Arial Nova"/>
                 <w:sz w:val="20"/>
                 <w:szCs w:val="20"/>
-              </w:rPr>
-              <w:t>{</w:t>
-            </w:r>
-            <w:proofErr w:type="spellStart"/>
-            <w:r>
-              <w:rPr>
-                <w:rFonts w:ascii="Arial Nova" w:hAnsi="Arial Nova"/>
-                <w:sz w:val="20"/>
-                <w:szCs w:val="20"/>
-              </w:rPr>
-              <w:t>tiempoTrabajo</w:t>
-            </w:r>
-            <w:proofErr w:type="spellEnd"/>
-            <w:r>
-              <w:rPr>
-                <w:rFonts w:ascii="Arial Nova" w:hAnsi="Arial Nova"/>
-                <w:sz w:val="20"/>
-                <w:szCs w:val="20"/>
-              </w:rPr>
-              <w:t>}</w:t>
+                <w:lang w:val="es-ES"/>
+              </w:rPr>
+              <w:t>{fechaLimiteEntrega}</w:t>
             </w:r>
           </w:p>
         </w:tc>
@@ -1184,25 +1070,7 @@
                 <w:sz w:val="20"/>
                 <w:szCs w:val="20"/>
               </w:rPr>
-              <w:t>{</w:t>
-            </w:r>
-            <w:proofErr w:type="spellStart"/>
-            <w:r>
-              <w:rPr>
-                <w:rFonts w:ascii="Arial Nova" w:hAnsi="Arial Nova"/>
-                <w:sz w:val="20"/>
-                <w:szCs w:val="20"/>
-              </w:rPr>
-              <w:t>reportarPresupuesto</w:t>
-            </w:r>
-            <w:proofErr w:type="spellEnd"/>
-            <w:r>
-              <w:rPr>
-                <w:rFonts w:ascii="Arial Nova" w:hAnsi="Arial Nova"/>
-                <w:sz w:val="20"/>
-                <w:szCs w:val="20"/>
-              </w:rPr>
-              <w:t>}</w:t>
+              <w:t>{reportarPresupuesto}</w:t>
             </w:r>
           </w:p>
         </w:tc>
@@ -1255,25 +1123,7 @@
                 <w:sz w:val="20"/>
                 <w:szCs w:val="20"/>
               </w:rPr>
-              <w:t>{</w:t>
-            </w:r>
-            <w:proofErr w:type="spellStart"/>
-            <w:r>
-              <w:rPr>
-                <w:rFonts w:ascii="Arial Nova" w:hAnsi="Arial Nova"/>
-                <w:sz w:val="20"/>
-                <w:szCs w:val="20"/>
-              </w:rPr>
-              <w:t>masEspecificaciones</w:t>
-            </w:r>
-            <w:proofErr w:type="spellEnd"/>
-            <w:r>
-              <w:rPr>
-                <w:rFonts w:ascii="Arial Nova" w:hAnsi="Arial Nova"/>
-                <w:sz w:val="20"/>
-                <w:szCs w:val="20"/>
-              </w:rPr>
-              <w:t>}</w:t>
+              <w:t>{masEspecificaciones}</w:t>
             </w:r>
           </w:p>
         </w:tc>
@@ -1350,25 +1200,7 @@
                 <w:sz w:val="20"/>
                 <w:szCs w:val="20"/>
               </w:rPr>
-              <w:t>{</w:t>
-            </w:r>
-            <w:proofErr w:type="spellStart"/>
-            <w:r>
-              <w:rPr>
-                <w:rFonts w:ascii="Arial Nova" w:hAnsi="Arial Nova"/>
-                <w:sz w:val="20"/>
-                <w:szCs w:val="20"/>
-              </w:rPr>
-              <w:t>criteriosExito</w:t>
-            </w:r>
-            <w:proofErr w:type="spellEnd"/>
-            <w:r>
-              <w:rPr>
-                <w:rFonts w:ascii="Arial Nova" w:hAnsi="Arial Nova"/>
-                <w:sz w:val="20"/>
-                <w:szCs w:val="20"/>
-              </w:rPr>
-              <w:t>}</w:t>
+              <w:t>{criteriosExito}</w:t>
             </w:r>
           </w:p>
         </w:tc>
@@ -1630,7 +1462,6 @@
               <w:lang w:val="es-ES"/>
             </w:rPr>
           </w:pPr>
-          <w:proofErr w:type="gramStart"/>
           <w:r>
             <w:rPr>
               <w:rFonts w:ascii="Arial Nova" w:eastAsia="Arial Nova" w:hAnsi="Arial Nova" w:cs="Arial Nova"/>
@@ -1639,18 +1470,7 @@
               <w:color w:val="AEAAAA" w:themeColor="background2" w:themeShade="BF"/>
               <w:lang w:val="es-ES"/>
             </w:rPr>
-            <w:t>FM.Project</w:t>
-          </w:r>
-          <w:proofErr w:type="gramEnd"/>
-          <w:r>
-            <w:rPr>
-              <w:rFonts w:ascii="Arial Nova" w:eastAsia="Arial Nova" w:hAnsi="Arial Nova" w:cs="Arial Nova"/>
-              <w:i/>
-              <w:iCs/>
-              <w:color w:val="AEAAAA" w:themeColor="background2" w:themeShade="BF"/>
-              <w:lang w:val="es-ES"/>
-            </w:rPr>
-            <w:t xml:space="preserve"> ID. #Cons</w:t>
+            <w:t>FM.Project ID. #Cons</w:t>
           </w:r>
         </w:p>
       </w:tc>

</xml_diff>